<commit_message>
Revise commissary dispatch: tighten voice, fix terminology, cut length
Corrected per Bilal's review: STORE guys (not "stretch guys"), no
"favors" — payback is stamps/fish/extra commissary; new arrivals have
nothing, not "not enough"; transferred property ships separately and
takes 1-3 months to catch up; Clean Slate understood to run at all
low-security institutions, not just Fort Dix. Cut from ~1,090 to 895
words and flattened the prose to a plainer, less literary register.
</commit_message>
<xml_diff>
--- a/content/substack/commissary-limit-600.docx
+++ b/content/substack/commissary-limit-600.docx
@@ -27,7 +27,7 @@
         <w:t xml:space="preserve">Title: </w:t>
       </w:r>
       <w:r>
-        <w:t>I Watched the Commissary Limit Jump to $600 and Knew Exactly What It Wouldn't Fix</w:t>
+        <w:t>I Watched the Commissary Limit Jump to $600 and Knew What It Wouldn't Fix</w:t>
       </w:r>
     </w:p>
     <w:p>
@@ -99,7 +99,7 @@
         <w:pStyle w:val="Heading1"/>
       </w:pPr>
       <w:r>
-        <w:t>I Watched the Commissary Limit Jump to $600 and Knew Exactly What It Wouldn't Fix</w:t>
+        <w:t>I Watched the Commissary Limit Jump to $600 and Knew What It Wouldn't Fix</w:t>
       </w:r>
     </w:p>
     <w:p>
@@ -129,12 +129,12 @@
     </w:p>
     <w:p>
       <w:r>
-        <w:t>My buddy caught up with me outside the chow hall and said there was a new notice on the electronic board. I didn't take his word for it. In here, you don't repeat anything you haven't read with your own eyes, so I walked over and read it myself.</w:t>
+        <w:t>My buddy told me there was a new notice on the board. I don't repeat anything I haven't read myself, so I walked over and read it.</w:t>
       </w:r>
     </w:p>
     <w:p>
       <w:r>
-        <w:t>Effective August 10, the Bureau of Prisons is raising the monthly commissary spending limit to $600.</w:t>
+        <w:t>Starting August 10, the commissary spending limit goes up to $600 a month.</w:t>
       </w:r>
     </w:p>
     <w:p>
@@ -147,27 +147,27 @@
     </w:p>
     <w:p>
       <w:r>
-        <w:t>That number needs context to land. For decades, the limit sat at $360 a month, system-wide, without moving. Six to twelve months ago it jumped to $460. Now, less than a year later, it's jumping again.</w:t>
+        <w:t>Here's the timeline. $360 was the limit for decades. Never moved. Six to twelve months ago it jumped to $460. Now, less than a year later, it's jumping again to $600. Two increases in under a year after decades of nothing.</w:t>
       </w:r>
     </w:p>
     <w:p>
       <w:r>
-        <w:t>Nobody I've talked to has seen the Bureau move like this. I've been in this system since 2012, through eight facilities, and this is two increases in under a year after decades of nothing.</w:t>
+        <w:t>I've been locked up since 2012, in eight different spots. Never seen the Bureau move this fast.</w:t>
       </w:r>
     </w:p>
     <w:p>
       <w:r>
-        <w:t>Here's my read on why. Commissary isn't charity — the profit off what we buy funds recreational programs and staffs the people who run them. The Bureau is short-staffed and paying some of the lowest starting wages in federal law enforcement, and it needs more money to compete for hires. Like any business, it also just doesn't turn away more revenue.</w:t>
+        <w:t>Why now? Commissary profit funds rec programs and pays the staff running them. The Bureau is short-staffed and pays some of the worst wages in federal law enforcement. More spending means more money to throw at that. And like any business, they don't turn away profit.</w:t>
       </w:r>
     </w:p>
     <w:p>
       <w:r>
-        <w:t>There's a policy piece too. Director William Marshall III and Deputy Director Joshua Smith — himself a former federal inmate pardoned by President Trump — have moved fast since taking over, and a lot of it does read as genuinely aimed at rehabilitation. Part of what made that possible: the collective bargaining agreement that used to govern almost everything about inmate life, down to what we could buy and how much, got terminated. For years, a vocal minority of officers used that agreement to block anything that helped inmates. That brake is gone.</w:t>
+        <w:t>There's a policy side too. Director Marshall and Deputy Director Joshua Smith — a guy who did federal time himself before Trump pardoned him — have been moving fast, and a lot of it actually helps guys in here. Part of why: the union contract that used to control almost everything about our lives, down to what we could buy, got killed. For years a loud group of officers used that contract to block anything that helped inmates. That's gone now.</w:t>
       </w:r>
     </w:p>
     <w:p>
       <w:r>
-        <w:t>The commissary increase isn't arriving alone. The Bureau is also authorizing the sale of recreational nicotine pouches for the first time, and replacing the old Keefe tablets with Securus tablets system-wide. All in the same stretch of months.</w:t>
+        <w:t>It's not just commissary. The Bureau's also letting commissary sell nicotine pouches for the first time, and swapping Keefe tablets for Securus. All around the same time.</w:t>
       </w:r>
     </w:p>
     <w:p>
@@ -180,12 +180,12 @@
     </w:p>
     <w:p>
       <w:r>
-        <w:t>For guys like me, this barely registers. I've got roughly two and a half years left, maybe eighteen months with a full year of halfway house, and I'm not restructuring anything around this.</w:t>
+        <w:t>For me, this doesn't change much. I've got about two and a half years left, maybe eighteen months with a full year in halfway house.</w:t>
       </w:r>
     </w:p>
     <w:p>
       <w:r>
-        <w:t>But for the compound, it changes something real. There's always been a network of guys — call them stretch guys — who front commissary to people whose own limit couldn't cover what they needed, and get paid back with interest or favors. When more people can cover themselves at $600 instead of maxing out at $360, fewer people need a stretch guy. That shifts who holds leverage on a compound.</w:t>
+        <w:t>But it changes the compound. Guys who front commissary to other people — we call them STORE guys — get paid back in stamps, fish (that's currency in here), or extra commissary on top. When more guys can cover themselves at $600 instead of maxing out at $360, fewer people need a STORE guy. That shifts who's got pull on a compound.</w:t>
       </w:r>
     </w:p>
     <w:p>
@@ -198,17 +198,17 @@
     </w:p>
     <w:p>
       <w:r>
-        <w:t>Here's what the notice didn't say, and what nobody outside is going to think to ask: your locker doesn't get bigger because your spending limit did.</w:t>
+        <w:t>Here's what the notice didn't say. Your locker doesn't get bigger because your spending limit did.</w:t>
       </w:r>
     </w:p>
     <w:p>
       <w:r>
-        <w:t>About two years ago, Fort Dix ran an operation everyone here still calls Clean Slate. Every housing unit was told to pack down to what fit in one sea bag — the military duffel — and anything left over got thrown out. By the time it was done, Fort Dix had filled two large dumpsters per housing unit, times eleven units, with property people had paid for out of their own accounts.</w:t>
+        <w:t>About two years ago the Bureau ran something called Clean Slate — official operation name, and from what I understand it hit every low-security institution, not just Fort Dix. Everybody packed down to one sea bag, the military duffel. Whatever didn't fit got thrown out. Fort Dix alone filled two dumpsters per unit, times eleven units, with stuff guys paid for out of pocket.</w:t>
       </w:r>
     </w:p>
     <w:p>
       <w:r>
-        <w:t>Counselors still walk units and confiscate anything sitting outside a locker as excess property, increase or no increase. Raise the limit to $600 and you raise how much people buy. Nothing about where it's supposed to go has changed.</w:t>
+        <w:t>Counselors still walk the unit and toss anything sitting outside your locker. Limit goes up, people buy more, and there's still nowhere to put it.</w:t>
       </w:r>
     </w:p>
     <w:p>
@@ -221,12 +221,12 @@
     </w:p>
     <w:p>
       <w:r>
-        <w:t>Then there's transfer. When the Bureau moves you, you get two boxes for your property. An officer packing you out can authorize a third box at their discretion, and you pay for it yourself.</w:t>
+        <w:t>Then there's transfer. You get two boxes when the Bureau moves you. A third is up to whoever's packing you out, at your expense. Even then, your property ships separately and can take one to three months to catch up to you at the new spot.</w:t>
       </w:r>
     </w:p>
     <w:p>
       <w:r>
-        <w:t>I've been through several transfers this past year — Big Spring, Lewisburg, a couple of stops through Oklahoma City in transit — and I've watched guys try to talk their way into that third box with mixed results. Most don't get it. Buy up to a $600 limit for months on end, and eventually the Bureau moves you somewhere else — what doesn't fit in two boxes doesn't come with you.</w:t>
+        <w:t>I've transferred a few times this year — Big Spring, Lewisburg, a couple stops through Oklahoma City. I've watched guys try to talk their way into that third box. Most don't get it. Buy up to $600 a month long enough, and eventually you get moved. Whatever doesn't fit in two boxes doesn't come with you.</w:t>
       </w:r>
     </w:p>
     <w:p>
@@ -247,12 +247,12 @@
     </w:p>
     <w:p>
       <w:r>
-        <w:t>If you're sending money to someone who just hit the system, $600 makes real sense for the first stretch — clothes, shoes, hygiene, the basics nobody arrives with enough of. Past that point, be honest about what they actually need. An inmate maxing out $600 a month, by the standards of this system right now, is institutionally wealthy.</w:t>
+        <w:t>If your person just hit the system, send what you can — they're starting with nothing. Past that, be realistic about what they need. Maxing out $600 a month makes a guy rich in here.</w:t>
       </w:r>
     </w:p>
     <w:p>
       <w:r>
-        <w:t>Before you load up an account, ask about IFRP. If your loved one has a payment plan — restitution, a fine, anything — that payment comes due around the 9th or 10th of the month, and it's on them to have the money there when it processes.</w:t>
+        <w:t>Ask about IFRP before you load up an account. If your person has restitution or a fine, that payment comes out around the 9th or 10th, and it's on them to have the money ready.</w:t>
       </w:r>
     </w:p>
     <w:p>
@@ -260,12 +260,12 @@
         <w:rPr>
           <w:b/>
         </w:rPr>
-        <w:t>WARNING: MISSING AN IFRP PAYMENT IS TREATED AS A REFUSAL REGARDLESS OF THE REASON. IT CAN COST FIRST STEP ACT DAYS, DROP SOMEONE TO COMMISSARY RESTRICTION AT $25 OF HYGIENE ITEMS A MONTH, AND STRIP HOUSING STATUS — IN MY UNIT, REFUSAL MEANS AN IMMEDIATE MOVE OUT OF A TWO-MAN ROOM INTO A TWELVE-MAN ROOM, AND GETTING BACK TAKES A NEW CONTRACT AND A FULL MONTH OF PAPERWORK.</w:t>
+        <w:t>WARNING: MISSING AN IFRP PAYMENT COUNTS AS A REFUSAL NO MATTER THE REASON. IT CAN COST FIRST STEP ACT DAYS, DROP SOMEONE TO $25 OF HYGIENE ITEMS A MONTH, AND COST THEIR HOUSING — IN MY UNIT, REFUSAL MEANS GETTING PULLED OUT OF A TWO-MAN ROOM AND INTO A TWELVE-MAN ROOM, AND GETTING BACK TAKES A NEW CONTRACT AND A MONTH OF PAPERWORK.</w:t>
       </w:r>
     </w:p>
     <w:p>
       <w:r>
-        <w:t>Think about storage before you think about spending. Lockers haven't gotten bigger. Transfer boxes haven't gotten bigger. Buy past what fits, and the Bureau will decide for you what happens to the rest.</w:t>
+        <w:t>Think about where it's going before you spend it. The locker's the same size. The boxes are the same size. Buy past that, and the Bureau decides what happens to the rest.</w:t>
       </w:r>
     </w:p>
     <w:p>
@@ -278,12 +278,12 @@
     </w:p>
     <w:p>
       <w:r>
-        <w:t>I read that notice standing at the board with three or four other guys, all of us doing the same math in our heads at the same time — spending power against locker space, against a transfer nobody can predict the timing of. Nobody said much.</w:t>
+        <w:t>I stood at that board with three or four other guys, all doing the same math — more to spend, same room to keep it. Nobody said much.</w:t>
       </w:r>
     </w:p>
     <w:p>
       <w:r>
-        <w:t>We've all learned that more room to spend and more room to keep are two different things. The Bureau only ever fixes one of them.</w:t>
+        <w:t>More room to spend and more room to keep are two different things. The Bureau only ever fixes one.</w:t>
       </w:r>
     </w:p>
     <w:p>
@@ -299,7 +299,7 @@
         <w:rPr>
           <w:i/>
         </w:rPr>
-        <w:t>If your loved one just told you about the $600 limit, what's the first thing you're planning to send them — and have you asked whether it'll fit?</w:t>
+        <w:t>If your person just told you about the $600 limit, what's the first thing you're sending them — and do you know if it'll even fit?</w:t>
       </w:r>
     </w:p>
     <w:p>

</xml_diff>

<commit_message>
Reframe commissary dispatch around the real reaction: shock, not irony
Bilal flagged that the "locker doesn't get bigger" framing was
manufactured — nobody on the compound was thinking about storage space
when the notice went up. The real reaction was disbelief that a
decades-flat $360 limit nearly doubled in under a year, across two
increases. Retitled and restructured around that. Moved the property/
Clean Slate/transfer-box facts out of the narrative thesis and into the
actionable section as practical advice instead. Fixed "store guys" to
lowercase in body text (the caps in Bilal's note were for emphasis to
me, not a term to render in caps).
</commit_message>
<xml_diff>
--- a/content/substack/commissary-limit-600.docx
+++ b/content/substack/commissary-limit-600.docx
@@ -27,7 +27,7 @@
         <w:t xml:space="preserve">Title: </w:t>
       </w:r>
       <w:r>
-        <w:t>I Watched the Commissary Limit Jump to $600 and Knew What It Wouldn't Fix</w:t>
+        <w:t>I Watched the BOP Nearly Double Our Commissary Limit and Couldn't Believe It</w:t>
       </w:r>
     </w:p>
     <w:p>
@@ -41,7 +41,7 @@
         <w:t xml:space="preserve">Subtitle: </w:t>
       </w:r>
       <w:r>
-        <w:t>More money to spend. Nowhere to put what you buy.</w:t>
+        <w:t>Decades at $360. Then two jumps in under a year.</w:t>
       </w:r>
     </w:p>
     <w:p>
@@ -99,7 +99,7 @@
         <w:pStyle w:val="Heading1"/>
       </w:pPr>
       <w:r>
-        <w:t>I Watched the Commissary Limit Jump to $600 and Knew What It Wouldn't Fix</w:t>
+        <w:t>I Watched the BOP Nearly Double Our Commissary Limit and Couldn't Believe It</w:t>
       </w:r>
     </w:p>
     <w:p>
@@ -108,7 +108,7 @@
           <w:i/>
           <w:sz w:val="26"/>
         </w:rPr>
-        <w:t>More money to spend. Nowhere to put what you buy.</w:t>
+        <w:t>Decades at $360. Then two jumps in under a year.</w:t>
       </w:r>
     </w:p>
     <w:p>
@@ -129,7 +129,7 @@
     </w:p>
     <w:p>
       <w:r>
-        <w:t>My buddy told me there was a new notice on the board. I don't repeat anything I haven't read myself, so I walked over and read it.</w:t>
+        <w:t>My buddy told me there was a new notice on the board. I don't repeat anything I haven't read myself, so I walked over and read it. I read it twice, because the number didn't look real the first time.</w:t>
       </w:r>
     </w:p>
     <w:p>
@@ -147,12 +147,20 @@
     </w:p>
     <w:p>
       <w:r>
-        <w:t>Here's the timeline. $360 was the limit for decades. Never moved. Six to twelve months ago it jumped to $460. Now, less than a year later, it's jumping again to $600. Two increases in under a year after decades of nothing.</w:t>
+        <w:t>Here's why that number stopped me. $360 was the limit for decades. Never moved. Six to twelve months ago it jumped to $460. Now, less than a year later, it's jumping again — to $600. Two increases in under a year, after decades of nothing. That's almost double where we started.</w:t>
       </w:r>
     </w:p>
     <w:p>
       <w:r>
-        <w:t>I've been locked up since 2012, in eight different spots. Never seen the Bureau move this fast.</w:t>
+        <w:t>I've been locked up since 2012, in eight different spots. I've never seen the Bureau move like this, and I've never seen a number jump that far, that fast.</w:t>
+      </w:r>
+    </w:p>
+    <w:p>
+      <w:pPr>
+        <w:jc w:val="center"/>
+      </w:pPr>
+      <w:r>
+        <w:t>* * *</w:t>
       </w:r>
     </w:p>
     <w:p>
@@ -185,48 +193,7 @@
     </w:p>
     <w:p>
       <w:r>
-        <w:t>But it changes the compound. Guys who front commissary to other people — we call them STORE guys — get paid back in stamps, fish (that's currency in here), or extra commissary on top. When more guys can cover themselves at $600 instead of maxing out at $360, fewer people need a STORE guy. That shifts who's got pull on a compound.</w:t>
-      </w:r>
-    </w:p>
-    <w:p>
-      <w:pPr>
-        <w:jc w:val="center"/>
-      </w:pPr>
-      <w:r>
-        <w:t>* * *</w:t>
-      </w:r>
-    </w:p>
-    <w:p>
-      <w:r>
-        <w:t>Here's what the notice didn't say. Your locker doesn't get bigger because your spending limit did.</w:t>
-      </w:r>
-    </w:p>
-    <w:p>
-      <w:r>
-        <w:t>About two years ago the Bureau ran something called Clean Slate — official operation name, and from what I understand it hit every low-security institution, not just Fort Dix. Everybody packed down to one sea bag, the military duffel. Whatever didn't fit got thrown out. Fort Dix alone filled two dumpsters per unit, times eleven units, with stuff guys paid for out of pocket.</w:t>
-      </w:r>
-    </w:p>
-    <w:p>
-      <w:r>
-        <w:t>Counselors still walk the unit and toss anything sitting outside your locker. Limit goes up, people buy more, and there's still nowhere to put it.</w:t>
-      </w:r>
-    </w:p>
-    <w:p>
-      <w:pPr>
-        <w:jc w:val="center"/>
-      </w:pPr>
-      <w:r>
-        <w:t>* * *</w:t>
-      </w:r>
-    </w:p>
-    <w:p>
-      <w:r>
-        <w:t>Then there's transfer. You get two boxes when the Bureau moves you. A third is up to whoever's packing you out, at your expense. Even then, your property ships separately and can take one to three months to catch up to you at the new spot.</w:t>
-      </w:r>
-    </w:p>
-    <w:p>
-      <w:r>
-        <w:t>I've transferred a few times this year — Big Spring, Lewisburg, a couple stops through Oklahoma City. I've watched guys try to talk their way into that third box. Most don't get it. Buy up to $600 a month long enough, and eventually you get moved. Whatever doesn't fit in two boxes doesn't come with you.</w:t>
+        <w:t>But it changes the compound. Guys who front commissary to other people — we call them store guys — get paid back in stamps, fish (that's currency in here), or extra commissary on top. When more guys can cover themselves at $600 instead of maxing out at $360, fewer people need a store guy. That shifts who's got pull on a compound.</w:t>
       </w:r>
     </w:p>
     <w:p>
@@ -252,7 +219,12 @@
     </w:p>
     <w:p>
       <w:r>
-        <w:t>Ask about IFRP before you load up an account. If your person has restitution or a fine, that payment comes out around the 9th or 10th, and it's on them to have the money ready.</w:t>
+        <w:t>A couple of practical things worth knowing before you load up an account. Lockers haven't gotten any bigger. About two years ago the Bureau ran an operation called Clean Slate — official name, and from what I understand it hit every low-security institution. Everybody packed down to one sea bag, the military duffel, and whatever didn't fit got thrown out. Counselors still confiscate anything sitting outside a locker. And if your person transfers, they only get two boxes — a third is up to whoever's packing them out, at their expense — and property ships separately, taking one to three months to catch up at the new spot.</w:t>
+      </w:r>
+    </w:p>
+    <w:p>
+      <w:r>
+        <w:t>Ask about IFRP too. If your person has restitution or a fine, that payment comes out around the 9th or 10th, and it's on them to have the money ready.</w:t>
       </w:r>
     </w:p>
     <w:p>
@@ -261,11 +233,6 @@
           <w:b/>
         </w:rPr>
         <w:t>WARNING: MISSING AN IFRP PAYMENT COUNTS AS A REFUSAL NO MATTER THE REASON. IT CAN COST FIRST STEP ACT DAYS, DROP SOMEONE TO $25 OF HYGIENE ITEMS A MONTH, AND COST THEIR HOUSING — IN MY UNIT, REFUSAL MEANS GETTING PULLED OUT OF A TWO-MAN ROOM AND INTO A TWELVE-MAN ROOM, AND GETTING BACK TAKES A NEW CONTRACT AND A MONTH OF PAPERWORK.</w:t>
-      </w:r>
-    </w:p>
-    <w:p>
-      <w:r>
-        <w:t>Think about where it's going before you spend it. The locker's the same size. The boxes are the same size. Buy past that, and the Bureau decides what happens to the rest.</w:t>
       </w:r>
     </w:p>
     <w:p>
@@ -278,12 +245,12 @@
     </w:p>
     <w:p>
       <w:r>
-        <w:t>I stood at that board with three or four other guys, all doing the same math — more to spend, same room to keep it. Nobody said much.</w:t>
+        <w:t>I stood at that board and read the number a second time before it sank in. Guys who've done eight, ten, twelve years in this system don't get surprised by much anymore. This one got me.</w:t>
       </w:r>
     </w:p>
     <w:p>
       <w:r>
-        <w:t>More room to spend and more room to keep are two different things. The Bureau only ever fixes one.</w:t>
+        <w:t>Nearly doubling a limit that sat still for decades, twice in under a year — that's not the Bureau I know. I don't know what it means yet. I just know I've never seen it move like this.</w:t>
       </w:r>
     </w:p>
     <w:p>
@@ -299,7 +266,7 @@
         <w:rPr>
           <w:i/>
         </w:rPr>
-        <w:t>If your person just told you about the $600 limit, what's the first thing you're sending them — and do you know if it'll even fit?</w:t>
+        <w:t>Has your person mentioned the $600 limit yet — and did it surprise you as much as it surprised us in here?</w:t>
       </w:r>
     </w:p>
     <w:p>

</xml_diff>